<commit_message>
Added new features and updated project structure
</commit_message>
<xml_diff>
--- a/MERN Phase Wise/Phase Wise Templets/Project Design Phase/Problem - Solution Fit Template/Problem - Solution Fit Template v1.docx
+++ b/MERN Phase Wise/Phase Wise Templets/Project Design Phase/Problem - Solution Fit Template/Problem - Solution Fit Template v1.docx
@@ -85,7 +85,7 @@
           </w:tcPr>
           <w:p>
             <w:r>
-              <w:t>15 February 2025</w:t>
+              <w:t>14 July 2026</w:t>
             </w:r>
           </w:p>
         </w:tc>
@@ -105,7 +105,9 @@
           <w:tcPr>
             <w:tcW w:w="4508" w:type="dxa"/>
           </w:tcPr>
-          <w:p/>
+          <w:p>
+            <w:r/>
+          </w:p>
         </w:tc>
       </w:tr>
       <w:tr>
@@ -123,7 +125,11 @@
           <w:tcPr>
             <w:tcW w:w="4508" w:type="dxa"/>
           </w:tcPr>
-          <w:p/>
+          <w:p>
+            <w:r>
+              <w:t>Nutrition Assistant</w:t>
+            </w:r>
+          </w:p>
         </w:tc>
       </w:tr>
       <w:tr>
@@ -371,6 +377,109 @@
           <w:t>https://medium.com/@epicantus/problem-solution-fit-canvas-aa3dd59cb4fe</w:t>
         </w:r>
       </w:hyperlink>
+    </w:p>
+    <w:p>
+      <w:pPr>
+        <w:pStyle w:val="Heading2"/>
+      </w:pPr>
+      <w:r>
+        <w:t>Problem–Solution Fit (Nutrition Assistant)</w:t>
+      </w:r>
+    </w:p>
+    <w:p>
+      <w:r>
+        <w:t>1. Customer Segments:</w:t>
+        <w:br/>
+        <w:t>• Health-conscious individuals</w:t>
+        <w:br/>
+        <w:t>• Students</w:t>
+        <w:br/>
+        <w:t>• Working professionals</w:t>
+        <w:br/>
+        <w:t>• Fitness enthusiasts</w:t>
+        <w:br/>
+        <w:br/>
+        <w:t>2. Jobs to be Done / Problems:</w:t>
+        <w:br/>
+        <w:t>• Track daily meals</w:t>
+        <w:br/>
+        <w:t>• Monitor calories and nutrients</w:t>
+        <w:br/>
+        <w:t>• Maintain a balanced diet</w:t>
+        <w:br/>
+        <w:t>• Improve overall health</w:t>
+        <w:br/>
+        <w:br/>
+        <w:t>3. Triggers:</w:t>
+        <w:br/>
+        <w:t>• Weight gain</w:t>
+        <w:br/>
+        <w:t>• Poor eating habits</w:t>
+        <w:br/>
+        <w:t>• Health check-up results</w:t>
+        <w:br/>
+        <w:t>• Fitness goals</w:t>
+        <w:br/>
+        <w:br/>
+        <w:t>4. Emotions Before:</w:t>
+        <w:br/>
+        <w:t>• Confused about nutrition</w:t>
+        <w:br/>
+        <w:t>• Frustrated by complex apps</w:t>
+        <w:br/>
+        <w:t>• Worried about unhealthy lifestyle</w:t>
+        <w:br/>
+        <w:br/>
+        <w:t>5. Customer Constraints:</w:t>
+        <w:br/>
+        <w:t>• Limited nutrition knowledge</w:t>
+        <w:br/>
+        <w:t>• Busy schedules</w:t>
+        <w:br/>
+        <w:t>• Lack of personalized guidance</w:t>
+        <w:br/>
+        <w:t>• Difficult meal planning</w:t>
+        <w:br/>
+        <w:br/>
+        <w:t>6. Problem Root Cause:</w:t>
+        <w:br/>
+        <w:t>• No single platform combining meal tracking, nutrition analysis, BMI, water intake, and diet planning.</w:t>
+        <w:br/>
+        <w:br/>
+        <w:t>7. Behaviors:</w:t>
+        <w:br/>
+        <w:t>• Searches diet tips online</w:t>
+        <w:br/>
+        <w:t>• Skips meal tracking</w:t>
+        <w:br/>
+        <w:t>• Uses multiple apps</w:t>
+        <w:br/>
+        <w:br/>
+        <w:t>8. Available Solutions:</w:t>
+        <w:br/>
+        <w:t>• Generic calorie trackers</w:t>
+        <w:br/>
+        <w:t>• Fitness apps</w:t>
+        <w:br/>
+        <w:t>• Manual diet planning</w:t>
+        <w:br/>
+        <w:br/>
+        <w:t>9. Your Solution:</w:t>
+        <w:br/>
+        <w:t>Nutrition Assistant provides secure login, USDA food search, meal tracking, nutrition analysis, BMI &amp; water intake calculators, personalized diet plans, dashboards, and progress visualization in one platform.</w:t>
+        <w:br/>
+        <w:br/>
+        <w:t>10. Channels &amp; Motivators:</w:t>
+        <w:br/>
+        <w:t>• Web application</w:t>
+        <w:br/>
+        <w:t>• Social media</w:t>
+        <w:br/>
+        <w:t>• College &amp; fitness communities</w:t>
+        <w:br/>
+        <w:t>• Health awareness campaigns</w:t>
+        <w:br/>
+      </w:r>
     </w:p>
     <w:sectPr>
       <w:pgSz w:w="11906" w:h="16838"/>

</xml_diff>